<commit_message>
Update user manual for Google Meet
</commit_message>
<xml_diff>
--- a/output/manual/Manual-KeyNotesAI.docx
+++ b/output/manual/Manual-KeyNotesAI.docx
@@ -150,7 +150,7 @@
                 <w:color w:val="35694F"/>
                 <w:sz w:val="20"/>
               </w:rPr>
-              <w:t xml:space="preserve">Versão 1.0  </w:t>
+              <w:t xml:space="preserve">Versão 1.1  </w:t>
             </w:r>
             <w:r>
               <w:rPr>
@@ -159,7 +159,7 @@
                 <w:color w:val="191A18"/>
                 <w:sz w:val="18"/>
               </w:rPr>
-              <w:t>Guia prático para usuários autorizados e administradores. Atualizado em 21/08/2026.</w:t>
+              <w:t>Guia prático para usuários autorizados e administradores. Atualizado em 24/08/2026, com suporte ao Google Meet.</w:t>
             </w:r>
           </w:p>
         </w:tc>
@@ -445,7 +445,7 @@
                 <w:color w:val="191A18"/>
                 <w:sz w:val="21"/>
               </w:rPr>
-              <w:t>Gravar ou importar</w:t>
+              <w:t>Escolher a origem e gravar</w:t>
             </w:r>
           </w:p>
           <w:p>
@@ -459,7 +459,7 @@
                 <w:color w:val="191A18"/>
                 <w:sz w:val="18"/>
               </w:rPr>
-              <w:t>Grave no navegador ou importe um áudio existente.</w:t>
+              <w:t>Use Google Meet + microfone para reuniões on-line, somente microfone para encontros presenciais, ou importe um áudio existente.</w:t>
             </w:r>
           </w:p>
         </w:tc>
@@ -1273,7 +1273,7 @@
           <w:color w:val="191A18"/>
           <w:sz w:val="19"/>
         </w:rPr>
-        <w:t>Escolha o modo de processamento. O padrão é Híbrido.</w:t>
+        <w:t>Escolha a origem do áudio: Google Meet + microfone (recomendado), somente Google Meet ou somente microfone.</w:t>
       </w:r>
     </w:p>
     <w:p>
@@ -1297,7 +1297,7 @@
           <w:color w:val="191A18"/>
           <w:sz w:val="19"/>
         </w:rPr>
-        <w:t>Clique em “Iniciar reunião e gravar”.</w:t>
+        <w:t>Escolha o modo de processamento. O padrão é Híbrido.</w:t>
       </w:r>
     </w:p>
     <w:p>
@@ -1321,7 +1321,7 @@
           <w:color w:val="191A18"/>
           <w:sz w:val="19"/>
         </w:rPr>
-        <w:t>Autorize o uso do microfone quando o navegador solicitar.</w:t>
+        <w:t>Clique no botão para iniciar a gravação.</w:t>
       </w:r>
     </w:p>
     <w:p>
@@ -1345,7 +1345,7 @@
           <w:color w:val="191A18"/>
           <w:sz w:val="19"/>
         </w:rPr>
-        <w:t>Durante a reunião, acompanhe o tempo e registre participantes quando necessário.</w:t>
+        <w:t>Autorize a captura solicitada pelo navegador.</w:t>
       </w:r>
     </w:p>
     <w:p>
@@ -1361,6 +1361,30 @@
           <w:sz w:val="19"/>
         </w:rPr>
         <w:t xml:space="preserve">6. </w:t>
+      </w:r>
+      <w:r>
+        <w:rPr>
+          <w:rFonts w:ascii="Aptos" w:hAnsi="Aptos"/>
+          <w:b w:val="0"/>
+          <w:color w:val="191A18"/>
+          <w:sz w:val="19"/>
+        </w:rPr>
+        <w:t>Durante a reunião, acompanhe o tempo e registre participantes quando necessário.</w:t>
+      </w:r>
+    </w:p>
+    <w:p>
+      <w:pPr>
+        <w:spacing w:after="60" w:line="264" w:lineRule="auto"/>
+        <w:ind w:left="360" w:hanging="259"/>
+      </w:pPr>
+      <w:r>
+        <w:rPr>
+          <w:rFonts w:ascii="Aptos" w:hAnsi="Aptos"/>
+          <w:b/>
+          <w:color w:val="C89A56"/>
+          <w:sz w:val="19"/>
+        </w:rPr>
+        <w:t xml:space="preserve">7. </w:t>
       </w:r>
       <w:r>
         <w:rPr>
@@ -1583,6 +1607,805 @@
         </w:rPr>
         <w:t>A área Reuniões exibe somente a reunião real em andamento.</w:t>
       </w:r>
+    </w:p>
+    <w:p>
+      <w:r>
+        <w:br w:type="page"/>
+      </w:r>
+    </w:p>
+    <w:p>
+      <w:pPr>
+        <w:pStyle w:val="Heading1"/>
+      </w:pPr>
+      <w:r>
+        <w:t>Google Meet: captura completa</w:t>
+      </w:r>
+    </w:p>
+    <w:p>
+      <w:pPr>
+        <w:spacing w:after="80" w:line="269" w:lineRule="auto"/>
+      </w:pPr>
+      <w:r>
+        <w:rPr>
+          <w:rFonts w:ascii="Aptos" w:hAnsi="Aptos"/>
+          <w:b w:val="0"/>
+          <w:color w:val="191A18"/>
+          <w:sz w:val="21"/>
+        </w:rPr>
+        <w:t>Para registrar corretamente uma reunião on-line, abra o Google Meet e o KeyNotesAI no Chrome ou Edge. O modo recomendado combina o áudio remoto da aba com sua voz captada pelo microfone.</w:t>
+      </w:r>
+    </w:p>
+    <w:p>
+      <w:pPr>
+        <w:pStyle w:val="Heading2"/>
+      </w:pPr>
+      <w:r>
+        <w:t>Google Meet + microfone (recomendado)</w:t>
+      </w:r>
+    </w:p>
+    <w:tbl>
+      <w:tblPr>
+        <w:tblW w:type="auto" w:w="0"/>
+        <w:jc w:val="center"/>
+        <w:tblLayout w:type="fixed"/>
+        <w:tblLook w:firstColumn="1" w:firstRow="1" w:lastColumn="0" w:lastRow="0" w:noHBand="0" w:noVBand="1" w:val="04A0"/>
+      </w:tblPr>
+      <w:tblGrid>
+        <w:gridCol w:w="792"/>
+        <w:gridCol w:w="8568"/>
+      </w:tblGrid>
+      <w:tr>
+        <w:tc>
+          <w:tcPr>
+            <w:tcW w:type="dxa" w:w="4802"/>
+            <w:shd w:fill="35694F"/>
+            <w:tcMar>
+              <w:top w:w="110" w:type="dxa"/>
+              <w:start w:w="90" w:type="dxa"/>
+              <w:bottom w:w="110" w:type="dxa"/>
+              <w:end w:w="90" w:type="dxa"/>
+            </w:tcMar>
+            <w:vAlign w:val="center"/>
+          </w:tcPr>
+          <w:p>
+            <w:pPr>
+              <w:jc w:val="center"/>
+            </w:pPr>
+            <w:r>
+              <w:rPr>
+                <w:rFonts w:ascii="Aptos" w:hAnsi="Aptos"/>
+                <w:b/>
+                <w:color w:val="FFFFFF"/>
+                <w:sz w:val="30"/>
+              </w:rPr>
+              <w:t>1</w:t>
+            </w:r>
+          </w:p>
+        </w:tc>
+        <w:tc>
+          <w:tcPr>
+            <w:tcW w:type="dxa" w:w="4802"/>
+            <w:shd w:fill="F5F1E8"/>
+            <w:tcMar>
+              <w:top w:w="110" w:type="dxa"/>
+              <w:start w:w="150" w:type="dxa"/>
+              <w:bottom w:w="110" w:type="dxa"/>
+              <w:end w:w="150" w:type="dxa"/>
+            </w:tcMar>
+          </w:tcPr>
+          <w:p>
+            <w:pPr>
+              <w:spacing w:after="40"/>
+            </w:pPr>
+            <w:r>
+              <w:rPr>
+                <w:rFonts w:ascii="Aptos" w:hAnsi="Aptos"/>
+                <w:b/>
+                <w:color w:val="191A18"/>
+                <w:sz w:val="21"/>
+              </w:rPr>
+              <w:t>Prepare as duas abas</w:t>
+            </w:r>
+          </w:p>
+          <w:p>
+            <w:pPr>
+              <w:spacing w:after="0"/>
+            </w:pPr>
+            <w:r>
+              <w:rPr>
+                <w:rFonts w:ascii="Aptos" w:hAnsi="Aptos"/>
+                <w:b w:val="0"/>
+                <w:color w:val="191A18"/>
+                <w:sz w:val="18"/>
+              </w:rPr>
+              <w:t>Entre na reunião pelo Google Meet e mantenha o KeyNotesAI aberto em outra aba do mesmo navegador.</w:t>
+            </w:r>
+          </w:p>
+        </w:tc>
+      </w:tr>
+    </w:tbl>
+    <w:p>
+      <w:pPr>
+        <w:spacing w:after="0"/>
+      </w:pPr>
+    </w:p>
+    <w:tbl>
+      <w:tblPr>
+        <w:tblW w:type="auto" w:w="0"/>
+        <w:jc w:val="center"/>
+        <w:tblLayout w:type="fixed"/>
+        <w:tblLook w:firstColumn="1" w:firstRow="1" w:lastColumn="0" w:lastRow="0" w:noHBand="0" w:noVBand="1" w:val="04A0"/>
+      </w:tblPr>
+      <w:tblGrid>
+        <w:gridCol w:w="792"/>
+        <w:gridCol w:w="8568"/>
+      </w:tblGrid>
+      <w:tr>
+        <w:tc>
+          <w:tcPr>
+            <w:tcW w:type="dxa" w:w="4802"/>
+            <w:shd w:fill="35694F"/>
+            <w:tcMar>
+              <w:top w:w="110" w:type="dxa"/>
+              <w:start w:w="90" w:type="dxa"/>
+              <w:bottom w:w="110" w:type="dxa"/>
+              <w:end w:w="90" w:type="dxa"/>
+            </w:tcMar>
+            <w:vAlign w:val="center"/>
+          </w:tcPr>
+          <w:p>
+            <w:pPr>
+              <w:jc w:val="center"/>
+            </w:pPr>
+            <w:r>
+              <w:rPr>
+                <w:rFonts w:ascii="Aptos" w:hAnsi="Aptos"/>
+                <w:b/>
+                <w:color w:val="FFFFFF"/>
+                <w:sz w:val="30"/>
+              </w:rPr>
+              <w:t>2</w:t>
+            </w:r>
+          </w:p>
+        </w:tc>
+        <w:tc>
+          <w:tcPr>
+            <w:tcW w:type="dxa" w:w="4802"/>
+            <w:shd w:fill="F5F1E8"/>
+            <w:tcMar>
+              <w:top w:w="110" w:type="dxa"/>
+              <w:start w:w="150" w:type="dxa"/>
+              <w:bottom w:w="110" w:type="dxa"/>
+              <w:end w:w="150" w:type="dxa"/>
+            </w:tcMar>
+          </w:tcPr>
+          <w:p>
+            <w:pPr>
+              <w:spacing w:after="40"/>
+            </w:pPr>
+            <w:r>
+              <w:rPr>
+                <w:rFonts w:ascii="Aptos" w:hAnsi="Aptos"/>
+                <w:b/>
+                <w:color w:val="191A18"/>
+                <w:sz w:val="21"/>
+              </w:rPr>
+              <w:t>Escolha a origem</w:t>
+            </w:r>
+          </w:p>
+          <w:p>
+            <w:pPr>
+              <w:spacing w:after="0"/>
+            </w:pPr>
+            <w:r>
+              <w:rPr>
+                <w:rFonts w:ascii="Aptos" w:hAnsi="Aptos"/>
+                <w:b w:val="0"/>
+                <w:color w:val="191A18"/>
+                <w:sz w:val="18"/>
+              </w:rPr>
+              <w:t>No KeyNotesAI, selecione “Google Meet + microfone (recomendado)”.</w:t>
+            </w:r>
+          </w:p>
+        </w:tc>
+      </w:tr>
+    </w:tbl>
+    <w:p>
+      <w:pPr>
+        <w:spacing w:after="0"/>
+      </w:pPr>
+    </w:p>
+    <w:tbl>
+      <w:tblPr>
+        <w:tblW w:type="auto" w:w="0"/>
+        <w:jc w:val="center"/>
+        <w:tblLayout w:type="fixed"/>
+        <w:tblLook w:firstColumn="1" w:firstRow="1" w:lastColumn="0" w:lastRow="0" w:noHBand="0" w:noVBand="1" w:val="04A0"/>
+      </w:tblPr>
+      <w:tblGrid>
+        <w:gridCol w:w="792"/>
+        <w:gridCol w:w="8568"/>
+      </w:tblGrid>
+      <w:tr>
+        <w:tc>
+          <w:tcPr>
+            <w:tcW w:type="dxa" w:w="4802"/>
+            <w:shd w:fill="35694F"/>
+            <w:tcMar>
+              <w:top w:w="110" w:type="dxa"/>
+              <w:start w:w="90" w:type="dxa"/>
+              <w:bottom w:w="110" w:type="dxa"/>
+              <w:end w:w="90" w:type="dxa"/>
+            </w:tcMar>
+            <w:vAlign w:val="center"/>
+          </w:tcPr>
+          <w:p>
+            <w:pPr>
+              <w:jc w:val="center"/>
+            </w:pPr>
+            <w:r>
+              <w:rPr>
+                <w:rFonts w:ascii="Aptos" w:hAnsi="Aptos"/>
+                <w:b/>
+                <w:color w:val="FFFFFF"/>
+                <w:sz w:val="30"/>
+              </w:rPr>
+              <w:t>3</w:t>
+            </w:r>
+          </w:p>
+        </w:tc>
+        <w:tc>
+          <w:tcPr>
+            <w:tcW w:type="dxa" w:w="4802"/>
+            <w:shd w:fill="F5F1E8"/>
+            <w:tcMar>
+              <w:top w:w="110" w:type="dxa"/>
+              <w:start w:w="150" w:type="dxa"/>
+              <w:bottom w:w="110" w:type="dxa"/>
+              <w:end w:w="150" w:type="dxa"/>
+            </w:tcMar>
+          </w:tcPr>
+          <w:p>
+            <w:pPr>
+              <w:spacing w:after="40"/>
+            </w:pPr>
+            <w:r>
+              <w:rPr>
+                <w:rFonts w:ascii="Aptos" w:hAnsi="Aptos"/>
+                <w:b/>
+                <w:color w:val="191A18"/>
+                <w:sz w:val="21"/>
+              </w:rPr>
+              <w:t>Inicie a gravação</w:t>
+            </w:r>
+          </w:p>
+          <w:p>
+            <w:pPr>
+              <w:spacing w:after="0"/>
+            </w:pPr>
+            <w:r>
+              <w:rPr>
+                <w:rFonts w:ascii="Aptos" w:hAnsi="Aptos"/>
+                <w:b w:val="0"/>
+                <w:color w:val="191A18"/>
+                <w:sz w:val="18"/>
+              </w:rPr>
+              <w:t>Clique em “Gravar reunião do Google Meet”. O navegador abrirá a janela de compartilhamento.</w:t>
+            </w:r>
+          </w:p>
+        </w:tc>
+      </w:tr>
+    </w:tbl>
+    <w:p>
+      <w:pPr>
+        <w:spacing w:after="0"/>
+      </w:pPr>
+    </w:p>
+    <w:tbl>
+      <w:tblPr>
+        <w:tblW w:type="auto" w:w="0"/>
+        <w:jc w:val="center"/>
+        <w:tblLayout w:type="fixed"/>
+        <w:tblLook w:firstColumn="1" w:firstRow="1" w:lastColumn="0" w:lastRow="0" w:noHBand="0" w:noVBand="1" w:val="04A0"/>
+      </w:tblPr>
+      <w:tblGrid>
+        <w:gridCol w:w="792"/>
+        <w:gridCol w:w="8568"/>
+      </w:tblGrid>
+      <w:tr>
+        <w:tc>
+          <w:tcPr>
+            <w:tcW w:type="dxa" w:w="4802"/>
+            <w:shd w:fill="35694F"/>
+            <w:tcMar>
+              <w:top w:w="110" w:type="dxa"/>
+              <w:start w:w="90" w:type="dxa"/>
+              <w:bottom w:w="110" w:type="dxa"/>
+              <w:end w:w="90" w:type="dxa"/>
+            </w:tcMar>
+            <w:vAlign w:val="center"/>
+          </w:tcPr>
+          <w:p>
+            <w:pPr>
+              <w:jc w:val="center"/>
+            </w:pPr>
+            <w:r>
+              <w:rPr>
+                <w:rFonts w:ascii="Aptos" w:hAnsi="Aptos"/>
+                <w:b/>
+                <w:color w:val="FFFFFF"/>
+                <w:sz w:val="30"/>
+              </w:rPr>
+              <w:t>4</w:t>
+            </w:r>
+          </w:p>
+        </w:tc>
+        <w:tc>
+          <w:tcPr>
+            <w:tcW w:type="dxa" w:w="4802"/>
+            <w:shd w:fill="F5F1E8"/>
+            <w:tcMar>
+              <w:top w:w="110" w:type="dxa"/>
+              <w:start w:w="150" w:type="dxa"/>
+              <w:bottom w:w="110" w:type="dxa"/>
+              <w:end w:w="150" w:type="dxa"/>
+            </w:tcMar>
+          </w:tcPr>
+          <w:p>
+            <w:pPr>
+              <w:spacing w:after="40"/>
+            </w:pPr>
+            <w:r>
+              <w:rPr>
+                <w:rFonts w:ascii="Aptos" w:hAnsi="Aptos"/>
+                <w:b/>
+                <w:color w:val="191A18"/>
+                <w:sz w:val="21"/>
+              </w:rPr>
+              <w:t>Selecione a aba correta</w:t>
+            </w:r>
+          </w:p>
+          <w:p>
+            <w:pPr>
+              <w:spacing w:after="0"/>
+            </w:pPr>
+            <w:r>
+              <w:rPr>
+                <w:rFonts w:ascii="Aptos" w:hAnsi="Aptos"/>
+                <w:b w:val="0"/>
+                <w:color w:val="191A18"/>
+                <w:sz w:val="18"/>
+              </w:rPr>
+              <w:t>Escolha especificamente a aba do Google Meet — não escolha uma janela ou a tela inteira.</w:t>
+            </w:r>
+          </w:p>
+        </w:tc>
+      </w:tr>
+    </w:tbl>
+    <w:p>
+      <w:pPr>
+        <w:spacing w:after="0"/>
+      </w:pPr>
+    </w:p>
+    <w:tbl>
+      <w:tblPr>
+        <w:tblW w:type="auto" w:w="0"/>
+        <w:jc w:val="center"/>
+        <w:tblLayout w:type="fixed"/>
+        <w:tblLook w:firstColumn="1" w:firstRow="1" w:lastColumn="0" w:lastRow="0" w:noHBand="0" w:noVBand="1" w:val="04A0"/>
+      </w:tblPr>
+      <w:tblGrid>
+        <w:gridCol w:w="792"/>
+        <w:gridCol w:w="8568"/>
+      </w:tblGrid>
+      <w:tr>
+        <w:tc>
+          <w:tcPr>
+            <w:tcW w:type="dxa" w:w="4802"/>
+            <w:shd w:fill="35694F"/>
+            <w:tcMar>
+              <w:top w:w="110" w:type="dxa"/>
+              <w:start w:w="90" w:type="dxa"/>
+              <w:bottom w:w="110" w:type="dxa"/>
+              <w:end w:w="90" w:type="dxa"/>
+            </w:tcMar>
+            <w:vAlign w:val="center"/>
+          </w:tcPr>
+          <w:p>
+            <w:pPr>
+              <w:jc w:val="center"/>
+            </w:pPr>
+            <w:r>
+              <w:rPr>
+                <w:rFonts w:ascii="Aptos" w:hAnsi="Aptos"/>
+                <w:b/>
+                <w:color w:val="FFFFFF"/>
+                <w:sz w:val="30"/>
+              </w:rPr>
+              <w:t>5</w:t>
+            </w:r>
+          </w:p>
+        </w:tc>
+        <w:tc>
+          <w:tcPr>
+            <w:tcW w:type="dxa" w:w="4802"/>
+            <w:shd w:fill="F5F1E8"/>
+            <w:tcMar>
+              <w:top w:w="110" w:type="dxa"/>
+              <w:start w:w="150" w:type="dxa"/>
+              <w:bottom w:w="110" w:type="dxa"/>
+              <w:end w:w="150" w:type="dxa"/>
+            </w:tcMar>
+          </w:tcPr>
+          <w:p>
+            <w:pPr>
+              <w:spacing w:after="40"/>
+            </w:pPr>
+            <w:r>
+              <w:rPr>
+                <w:rFonts w:ascii="Aptos" w:hAnsi="Aptos"/>
+                <w:b/>
+                <w:color w:val="191A18"/>
+                <w:sz w:val="21"/>
+              </w:rPr>
+              <w:t>Compartilhe o áudio</w:t>
+            </w:r>
+          </w:p>
+          <w:p>
+            <w:pPr>
+              <w:spacing w:after="0"/>
+            </w:pPr>
+            <w:r>
+              <w:rPr>
+                <w:rFonts w:ascii="Aptos" w:hAnsi="Aptos"/>
+                <w:b w:val="0"/>
+                <w:color w:val="191A18"/>
+                <w:sz w:val="18"/>
+              </w:rPr>
+              <w:t>Marque “Compartilhar áudio da guia” e confirme. Sem essa opção, as vozes remotas não serão gravadas.</w:t>
+            </w:r>
+          </w:p>
+        </w:tc>
+      </w:tr>
+    </w:tbl>
+    <w:p>
+      <w:pPr>
+        <w:spacing w:after="0"/>
+      </w:pPr>
+    </w:p>
+    <w:tbl>
+      <w:tblPr>
+        <w:tblW w:type="auto" w:w="0"/>
+        <w:jc w:val="center"/>
+        <w:tblLayout w:type="fixed"/>
+        <w:tblLook w:firstColumn="1" w:firstRow="1" w:lastColumn="0" w:lastRow="0" w:noHBand="0" w:noVBand="1" w:val="04A0"/>
+      </w:tblPr>
+      <w:tblGrid>
+        <w:gridCol w:w="792"/>
+        <w:gridCol w:w="8568"/>
+      </w:tblGrid>
+      <w:tr>
+        <w:tc>
+          <w:tcPr>
+            <w:tcW w:type="dxa" w:w="4802"/>
+            <w:shd w:fill="35694F"/>
+            <w:tcMar>
+              <w:top w:w="110" w:type="dxa"/>
+              <w:start w:w="90" w:type="dxa"/>
+              <w:bottom w:w="110" w:type="dxa"/>
+              <w:end w:w="90" w:type="dxa"/>
+            </w:tcMar>
+            <w:vAlign w:val="center"/>
+          </w:tcPr>
+          <w:p>
+            <w:pPr>
+              <w:jc w:val="center"/>
+            </w:pPr>
+            <w:r>
+              <w:rPr>
+                <w:rFonts w:ascii="Aptos" w:hAnsi="Aptos"/>
+                <w:b/>
+                <w:color w:val="FFFFFF"/>
+                <w:sz w:val="30"/>
+              </w:rPr>
+              <w:t>6</w:t>
+            </w:r>
+          </w:p>
+        </w:tc>
+        <w:tc>
+          <w:tcPr>
+            <w:tcW w:type="dxa" w:w="4802"/>
+            <w:shd w:fill="F5F1E8"/>
+            <w:tcMar>
+              <w:top w:w="110" w:type="dxa"/>
+              <w:start w:w="150" w:type="dxa"/>
+              <w:bottom w:w="110" w:type="dxa"/>
+              <w:end w:w="150" w:type="dxa"/>
+            </w:tcMar>
+          </w:tcPr>
+          <w:p>
+            <w:pPr>
+              <w:spacing w:after="40"/>
+            </w:pPr>
+            <w:r>
+              <w:rPr>
+                <w:rFonts w:ascii="Aptos" w:hAnsi="Aptos"/>
+                <w:b/>
+                <w:color w:val="191A18"/>
+                <w:sz w:val="21"/>
+              </w:rPr>
+              <w:t>Autorize o microfone</w:t>
+            </w:r>
+          </w:p>
+          <w:p>
+            <w:pPr>
+              <w:spacing w:after="0"/>
+            </w:pPr>
+            <w:r>
+              <w:rPr>
+                <w:rFonts w:ascii="Aptos" w:hAnsi="Aptos"/>
+                <w:b w:val="0"/>
+                <w:color w:val="191A18"/>
+                <w:sz w:val="18"/>
+              </w:rPr>
+              <w:t>Permita o acesso ao microfone para incluir sua própria voz com boa qualidade.</w:t>
+            </w:r>
+          </w:p>
+        </w:tc>
+      </w:tr>
+    </w:tbl>
+    <w:p>
+      <w:pPr>
+        <w:spacing w:after="0"/>
+      </w:pPr>
+    </w:p>
+    <w:tbl>
+      <w:tblPr>
+        <w:tblW w:type="auto" w:w="0"/>
+        <w:jc w:val="center"/>
+        <w:tblLayout w:type="fixed"/>
+        <w:tblLook w:firstColumn="1" w:firstRow="1" w:lastColumn="0" w:lastRow="0" w:noHBand="0" w:noVBand="1" w:val="04A0"/>
+      </w:tblPr>
+      <w:tblGrid>
+        <w:gridCol w:w="792"/>
+        <w:gridCol w:w="8568"/>
+      </w:tblGrid>
+      <w:tr>
+        <w:tc>
+          <w:tcPr>
+            <w:tcW w:type="dxa" w:w="4802"/>
+            <w:shd w:fill="35694F"/>
+            <w:tcMar>
+              <w:top w:w="110" w:type="dxa"/>
+              <w:start w:w="90" w:type="dxa"/>
+              <w:bottom w:w="110" w:type="dxa"/>
+              <w:end w:w="90" w:type="dxa"/>
+            </w:tcMar>
+            <w:vAlign w:val="center"/>
+          </w:tcPr>
+          <w:p>
+            <w:pPr>
+              <w:jc w:val="center"/>
+            </w:pPr>
+            <w:r>
+              <w:rPr>
+                <w:rFonts w:ascii="Aptos" w:hAnsi="Aptos"/>
+                <w:b/>
+                <w:color w:val="FFFFFF"/>
+                <w:sz w:val="30"/>
+              </w:rPr>
+              <w:t>7</w:t>
+            </w:r>
+          </w:p>
+        </w:tc>
+        <w:tc>
+          <w:tcPr>
+            <w:tcW w:type="dxa" w:w="4802"/>
+            <w:shd w:fill="F5F1E8"/>
+            <w:tcMar>
+              <w:top w:w="110" w:type="dxa"/>
+              <w:start w:w="150" w:type="dxa"/>
+              <w:bottom w:w="110" w:type="dxa"/>
+              <w:end w:w="150" w:type="dxa"/>
+            </w:tcMar>
+          </w:tcPr>
+          <w:p>
+            <w:pPr>
+              <w:spacing w:after="40"/>
+            </w:pPr>
+            <w:r>
+              <w:rPr>
+                <w:rFonts w:ascii="Aptos" w:hAnsi="Aptos"/>
+                <w:b/>
+                <w:color w:val="191A18"/>
+                <w:sz w:val="21"/>
+              </w:rPr>
+              <w:t>Finalize</w:t>
+            </w:r>
+          </w:p>
+          <w:p>
+            <w:pPr>
+              <w:spacing w:after="0"/>
+            </w:pPr>
+            <w:r>
+              <w:rPr>
+                <w:rFonts w:ascii="Aptos" w:hAnsi="Aptos"/>
+                <w:b w:val="0"/>
+                <w:color w:val="191A18"/>
+                <w:sz w:val="18"/>
+              </w:rPr>
+              <w:t>Encerre no KeyNotesAI. Se você interromper o compartilhamento da aba, a gravação será encerrada e salva automaticamente.</w:t>
+            </w:r>
+          </w:p>
+        </w:tc>
+      </w:tr>
+    </w:tbl>
+    <w:p>
+      <w:pPr>
+        <w:spacing w:after="0"/>
+      </w:pPr>
+    </w:p>
+    <w:tbl>
+      <w:tblPr>
+        <w:tblW w:type="auto" w:w="0"/>
+        <w:jc w:val="center"/>
+        <w:tblLayout w:type="fixed"/>
+        <w:tblLook w:firstColumn="1" w:firstRow="1" w:lastColumn="0" w:lastRow="0" w:noHBand="0" w:noVBand="1" w:val="04A0"/>
+      </w:tblPr>
+      <w:tblGrid>
+        <w:gridCol w:w="9360"/>
+      </w:tblGrid>
+      <w:tr>
+        <w:tc>
+          <w:tcPr>
+            <w:tcW w:type="dxa" w:w="9605"/>
+            <w:shd w:fill="F5F1E8"/>
+            <w:tcMar>
+              <w:top w:w="130" w:type="dxa"/>
+              <w:start w:w="170" w:type="dxa"/>
+              <w:bottom w:w="130" w:type="dxa"/>
+              <w:end w:w="170" w:type="dxa"/>
+            </w:tcMar>
+          </w:tcPr>
+          <w:p>
+            <w:pPr>
+              <w:spacing w:after="60"/>
+            </w:pPr>
+            <w:r>
+              <w:rPr>
+                <w:rFonts w:ascii="Aptos" w:hAnsi="Aptos"/>
+                <w:b/>
+                <w:color w:val="35694F"/>
+                <w:sz w:val="20"/>
+              </w:rPr>
+              <w:t xml:space="preserve">Uso de fones  </w:t>
+            </w:r>
+            <w:r>
+              <w:rPr>
+                <w:rFonts w:ascii="Aptos" w:hAnsi="Aptos"/>
+                <w:b w:val="0"/>
+                <w:color w:val="191A18"/>
+                <w:sz w:val="18"/>
+              </w:rPr>
+              <w:t>Recomendado no modo Google Meet + microfone: evita que o microfone recapture o som dos alto-falantes e reduz eco.</w:t>
+            </w:r>
+          </w:p>
+        </w:tc>
+      </w:tr>
+    </w:tbl>
+    <w:p>
+      <w:pPr>
+        <w:spacing w:after="20"/>
+      </w:pPr>
+    </w:p>
+    <w:p>
+      <w:pPr>
+        <w:pStyle w:val="Heading2"/>
+      </w:pPr>
+      <w:r>
+        <w:t>Outros modos</w:t>
+      </w:r>
+    </w:p>
+    <w:p>
+      <w:pPr>
+        <w:spacing w:after="60" w:line="264" w:lineRule="auto"/>
+        <w:ind w:left="360" w:hanging="259"/>
+      </w:pPr>
+      <w:r>
+        <w:rPr>
+          <w:rFonts w:ascii="Aptos" w:hAnsi="Aptos"/>
+          <w:b/>
+          <w:color w:val="C89A56"/>
+          <w:sz w:val="19"/>
+        </w:rPr>
+        <w:t xml:space="preserve">• </w:t>
+      </w:r>
+      <w:r>
+        <w:rPr>
+          <w:rFonts w:ascii="Aptos" w:hAnsi="Aptos"/>
+          <w:b w:val="0"/>
+          <w:color w:val="191A18"/>
+          <w:sz w:val="19"/>
+        </w:rPr>
+        <w:t>Google Meet — somente áudio da aba: grava os participantes remotos, mas pode não registrar bem sua voz local.</w:t>
+      </w:r>
+    </w:p>
+    <w:p>
+      <w:pPr>
+        <w:spacing w:after="60" w:line="264" w:lineRule="auto"/>
+        <w:ind w:left="360" w:hanging="259"/>
+      </w:pPr>
+      <w:r>
+        <w:rPr>
+          <w:rFonts w:ascii="Aptos" w:hAnsi="Aptos"/>
+          <w:b/>
+          <w:color w:val="C89A56"/>
+          <w:sz w:val="19"/>
+        </w:rPr>
+        <w:t xml:space="preserve">• </w:t>
+      </w:r>
+      <w:r>
+        <w:rPr>
+          <w:rFonts w:ascii="Aptos" w:hAnsi="Aptos"/>
+          <w:b w:val="0"/>
+          <w:color w:val="191A18"/>
+          <w:sz w:val="19"/>
+        </w:rPr>
+        <w:t>Presencial — somente microfone: indicado para pessoas reunidas fisicamente no mesmo ambiente.</w:t>
+      </w:r>
+    </w:p>
+    <w:tbl>
+      <w:tblPr>
+        <w:tblW w:type="auto" w:w="0"/>
+        <w:jc w:val="center"/>
+        <w:tblLayout w:type="fixed"/>
+        <w:tblLook w:firstColumn="1" w:firstRow="1" w:lastColumn="0" w:lastRow="0" w:noHBand="0" w:noVBand="1" w:val="04A0"/>
+      </w:tblPr>
+      <w:tblGrid>
+        <w:gridCol w:w="9360"/>
+      </w:tblGrid>
+      <w:tr>
+        <w:tc>
+          <w:tcPr>
+            <w:tcW w:type="dxa" w:w="9605"/>
+            <w:shd w:fill="F5F1E8"/>
+            <w:tcMar>
+              <w:top w:w="130" w:type="dxa"/>
+              <w:start w:w="170" w:type="dxa"/>
+              <w:bottom w:w="130" w:type="dxa"/>
+              <w:end w:w="170" w:type="dxa"/>
+            </w:tcMar>
+          </w:tcPr>
+          <w:p>
+            <w:pPr>
+              <w:spacing w:after="60"/>
+            </w:pPr>
+            <w:r>
+              <w:rPr>
+                <w:rFonts w:ascii="Aptos" w:hAnsi="Aptos"/>
+                <w:b/>
+                <w:color w:val="35694F"/>
+                <w:sz w:val="20"/>
+              </w:rPr>
+              <w:t xml:space="preserve">Consentimento  </w:t>
+            </w:r>
+            <w:r>
+              <w:rPr>
+                <w:rFonts w:ascii="Aptos" w:hAnsi="Aptos"/>
+                <w:b w:val="0"/>
+                <w:color w:val="191A18"/>
+                <w:sz w:val="18"/>
+              </w:rPr>
+              <w:t>Avise os participantes antes de iniciar e obtenha consentimento para gravação e processamento. O navegador sempre exige uma seleção manual da aba por segurança.</w:t>
+            </w:r>
+          </w:p>
+        </w:tc>
+      </w:tr>
+    </w:tbl>
+    <w:p>
+      <w:pPr>
+        <w:spacing w:after="20"/>
+      </w:pPr>
     </w:p>
     <w:p>
       <w:r>
@@ -2682,6 +3505,52 @@
           </w:p>
         </w:tc>
       </w:tr>
+      <w:tr>
+        <w:tc>
+          <w:tcPr>
+            <w:tcW w:type="dxa" w:w="2880"/>
+            <w:tcMar>
+              <w:top w:w="90" w:type="dxa"/>
+              <w:start w:w="120" w:type="dxa"/>
+              <w:bottom w:w="90" w:type="dxa"/>
+              <w:end w:w="120" w:type="dxa"/>
+            </w:tcMar>
+          </w:tcPr>
+          <w:p>
+            <w:r>
+              <w:rPr>
+                <w:rFonts w:ascii="Aptos" w:hAnsi="Aptos"/>
+                <w:b/>
+                <w:color w:val="35694F"/>
+                <w:sz w:val="18"/>
+              </w:rPr>
+              <w:t>Mapa mental</w:t>
+            </w:r>
+          </w:p>
+        </w:tc>
+        <w:tc>
+          <w:tcPr>
+            <w:tcW w:type="dxa" w:w="6480"/>
+            <w:tcMar>
+              <w:top w:w="90" w:type="dxa"/>
+              <w:start w:w="120" w:type="dxa"/>
+              <w:bottom w:w="90" w:type="dxa"/>
+              <w:end w:w="120" w:type="dxa"/>
+            </w:tcMar>
+          </w:tcPr>
+          <w:p>
+            <w:r>
+              <w:rPr>
+                <w:rFonts w:ascii="Aptos" w:hAnsi="Aptos"/>
+                <w:b w:val="0"/>
+                <w:color w:val="191A18"/>
+                <w:sz w:val="18"/>
+              </w:rPr>
+              <w:t>Estrutura visual automática dos temas e relações, em uma página A4 com fundo branco.</w:t>
+            </w:r>
+          </w:p>
+        </w:tc>
+      </w:tr>
     </w:tbl>
     <w:p>
       <w:pPr>
@@ -3672,7 +4541,31 @@
           <w:color w:val="191A18"/>
           <w:sz w:val="19"/>
         </w:rPr>
-        <w:t>Transcrição e documentos gerados.</w:t>
+        <w:t>Ata, resumo executivo, plano de ação, decisões e transcrição em PDF — sem conversão para Google Docs.</w:t>
+      </w:r>
+    </w:p>
+    <w:p>
+      <w:pPr>
+        <w:spacing w:after="60" w:line="264" w:lineRule="auto"/>
+        <w:ind w:left="360" w:hanging="259"/>
+      </w:pPr>
+      <w:r>
+        <w:rPr>
+          <w:rFonts w:ascii="Aptos" w:hAnsi="Aptos"/>
+          <w:b/>
+          <w:color w:val="C89A56"/>
+          <w:sz w:val="19"/>
+        </w:rPr>
+        <w:t xml:space="preserve">• </w:t>
+      </w:r>
+      <w:r>
+        <w:rPr>
+          <w:rFonts w:ascii="Aptos" w:hAnsi="Aptos"/>
+          <w:b w:val="0"/>
+          <w:color w:val="191A18"/>
+          <w:sz w:val="19"/>
+        </w:rPr>
+        <w:t>Mapa mental em formato vetorial, com fundo branco.</w:t>
       </w:r>
     </w:p>
     <w:p>
@@ -3920,6 +4813,28 @@
           <w:sz w:val="19"/>
         </w:rPr>
         <w:t>Manualmente: pelo botão “Sincronizar/Atualizar no Trello”, útil depois de ajustes que ainda não passaram pelo Drive.</w:t>
+      </w:r>
+    </w:p>
+    <w:p>
+      <w:pPr>
+        <w:pStyle w:val="Heading2"/>
+      </w:pPr>
+      <w:r>
+        <w:t>Abrir o quadro</w:t>
+      </w:r>
+    </w:p>
+    <w:p>
+      <w:pPr>
+        <w:spacing w:after="80" w:line="269" w:lineRule="auto"/>
+      </w:pPr>
+      <w:r>
+        <w:rPr>
+          <w:rFonts w:ascii="Aptos" w:hAnsi="Aptos"/>
+          <w:b w:val="0"/>
+          <w:color w:val="191A18"/>
+          <w:sz w:val="19"/>
+        </w:rPr>
+        <w:t>Na Visão geral, clique em “Abrir quadro no Trello”. O botão utiliza a URL real do quadro escolhido em Integrações e abre o destino em uma nova aba. Se ainda não houver destino, o sistema orienta o administrador a selecionar Quadro e Lista.</w:t>
       </w:r>
     </w:p>
     <w:p>
@@ -4910,6 +5825,144 @@
                 <w:sz w:val="17"/>
               </w:rPr>
               <w:t>Revise a permissão do navegador, selecione o microfone correto e recarregue a página.</w:t>
+            </w:r>
+          </w:p>
+        </w:tc>
+      </w:tr>
+      <w:tr>
+        <w:tc>
+          <w:tcPr>
+            <w:tcW w:type="dxa" w:w="3240"/>
+            <w:tcMar>
+              <w:top w:w="90" w:type="dxa"/>
+              <w:start w:w="120" w:type="dxa"/>
+              <w:bottom w:w="90" w:type="dxa"/>
+              <w:end w:w="120" w:type="dxa"/>
+            </w:tcMar>
+          </w:tcPr>
+          <w:p>
+            <w:r>
+              <w:rPr>
+                <w:rFonts w:ascii="Aptos" w:hAnsi="Aptos"/>
+                <w:b/>
+                <w:color w:val="35694F"/>
+                <w:sz w:val="17"/>
+              </w:rPr>
+              <w:t>Meet sem áudio remoto</w:t>
+            </w:r>
+          </w:p>
+        </w:tc>
+        <w:tc>
+          <w:tcPr>
+            <w:tcW w:type="dxa" w:w="6120"/>
+            <w:tcMar>
+              <w:top w:w="90" w:type="dxa"/>
+              <w:start w:w="120" w:type="dxa"/>
+              <w:bottom w:w="90" w:type="dxa"/>
+              <w:end w:w="120" w:type="dxa"/>
+            </w:tcMar>
+          </w:tcPr>
+          <w:p>
+            <w:r>
+              <w:rPr>
+                <w:rFonts w:ascii="Aptos" w:hAnsi="Aptos"/>
+                <w:b w:val="0"/>
+                <w:color w:val="191A18"/>
+                <w:sz w:val="17"/>
+              </w:rPr>
+              <w:t>Use Chrome/Edge, selecione a aba do Meet e marque “Compartilhar áudio da guia”. Não escolha tela inteira ou janela.</w:t>
+            </w:r>
+          </w:p>
+        </w:tc>
+      </w:tr>
+      <w:tr>
+        <w:tc>
+          <w:tcPr>
+            <w:tcW w:type="dxa" w:w="3240"/>
+            <w:tcMar>
+              <w:top w:w="90" w:type="dxa"/>
+              <w:start w:w="120" w:type="dxa"/>
+              <w:bottom w:w="90" w:type="dxa"/>
+              <w:end w:w="120" w:type="dxa"/>
+            </w:tcMar>
+          </w:tcPr>
+          <w:p>
+            <w:r>
+              <w:rPr>
+                <w:rFonts w:ascii="Aptos" w:hAnsi="Aptos"/>
+                <w:b/>
+                <w:color w:val="35694F"/>
+                <w:sz w:val="17"/>
+              </w:rPr>
+              <w:t>Minha voz não aparece</w:t>
+            </w:r>
+          </w:p>
+        </w:tc>
+        <w:tc>
+          <w:tcPr>
+            <w:tcW w:type="dxa" w:w="6120"/>
+            <w:tcMar>
+              <w:top w:w="90" w:type="dxa"/>
+              <w:start w:w="120" w:type="dxa"/>
+              <w:bottom w:w="90" w:type="dxa"/>
+              <w:end w:w="120" w:type="dxa"/>
+            </w:tcMar>
+          </w:tcPr>
+          <w:p>
+            <w:r>
+              <w:rPr>
+                <w:rFonts w:ascii="Aptos" w:hAnsi="Aptos"/>
+                <w:b w:val="0"/>
+                <w:color w:val="191A18"/>
+                <w:sz w:val="17"/>
+              </w:rPr>
+              <w:t>Use “Google Meet + microfone” e autorize o microfone. O modo somente aba pode não incluir sua voz local.</w:t>
+            </w:r>
+          </w:p>
+        </w:tc>
+      </w:tr>
+      <w:tr>
+        <w:tc>
+          <w:tcPr>
+            <w:tcW w:type="dxa" w:w="3240"/>
+            <w:tcMar>
+              <w:top w:w="90" w:type="dxa"/>
+              <w:start w:w="120" w:type="dxa"/>
+              <w:bottom w:w="90" w:type="dxa"/>
+              <w:end w:w="120" w:type="dxa"/>
+            </w:tcMar>
+          </w:tcPr>
+          <w:p>
+            <w:r>
+              <w:rPr>
+                <w:rFonts w:ascii="Aptos" w:hAnsi="Aptos"/>
+                <w:b/>
+                <w:color w:val="35694F"/>
+                <w:sz w:val="17"/>
+              </w:rPr>
+              <w:t>Gravação encerrou sozinha</w:t>
+            </w:r>
+          </w:p>
+        </w:tc>
+        <w:tc>
+          <w:tcPr>
+            <w:tcW w:type="dxa" w:w="6120"/>
+            <w:tcMar>
+              <w:top w:w="90" w:type="dxa"/>
+              <w:start w:w="120" w:type="dxa"/>
+              <w:bottom w:w="90" w:type="dxa"/>
+              <w:end w:w="120" w:type="dxa"/>
+            </w:tcMar>
+          </w:tcPr>
+          <w:p>
+            <w:r>
+              <w:rPr>
+                <w:rFonts w:ascii="Aptos" w:hAnsi="Aptos"/>
+                <w:b w:val="0"/>
+                <w:color w:val="191A18"/>
+                <w:sz w:val="17"/>
+              </w:rPr>
+              <w:t>Interromper o compartilhamento da aba encerra e salva a gravação automaticamente.</w:t>
             </w:r>
           </w:p>
         </w:tc>
@@ -5295,7 +6348,31 @@
           <w:color w:val="191A18"/>
           <w:sz w:val="19"/>
         </w:rPr>
-        <w:t>Título claro e modo de processamento escolhido.</w:t>
+        <w:t>Título claro, origem do áudio e modo de processamento escolhidos.</w:t>
+      </w:r>
+    </w:p>
+    <w:p>
+      <w:pPr>
+        <w:spacing w:after="60" w:line="264" w:lineRule="auto"/>
+        <w:ind w:left="360" w:hanging="259"/>
+      </w:pPr>
+      <w:r>
+        <w:rPr>
+          <w:rFonts w:ascii="Aptos" w:hAnsi="Aptos"/>
+          <w:b/>
+          <w:color w:val="C89A56"/>
+          <w:sz w:val="19"/>
+        </w:rPr>
+        <w:t xml:space="preserve">• </w:t>
+      </w:r>
+      <w:r>
+        <w:rPr>
+          <w:rFonts w:ascii="Aptos" w:hAnsi="Aptos"/>
+          <w:b w:val="0"/>
+          <w:color w:val="191A18"/>
+          <w:sz w:val="19"/>
+        </w:rPr>
+        <w:t>No Google Meet: aba correta selecionada, áudio da guia compartilhado e microfone autorizado quando necessário.</w:t>
       </w:r>
     </w:p>
     <w:p>
@@ -5487,7 +6564,7 @@
           <w:color w:val="191A18"/>
           <w:sz w:val="19"/>
         </w:rPr>
-        <w:t>Pasta do Drive arquivada/atualizada sem duplicidade.</w:t>
+        <w:t>Pasta do Drive arquivada/atualizada sem duplicidade e com PDFs.</w:t>
       </w:r>
     </w:p>
     <w:p>
@@ -5580,7 +6657,7 @@
                 <w:color w:val="191A18"/>
                 <w:sz w:val="18"/>
               </w:rPr>
-              <w:t>Reunião → transcrição → revisão → análise → documentos → ações → Drive → Trello.</w:t>
+              <w:t>Google Meet/presencial → gravação → transcrição → revisão → análise → documentos → ações → Drive → Trello.</w:t>
             </w:r>
           </w:p>
         </w:tc>
@@ -5831,7 +6908,7 @@
           <w:color w:val="73756F"/>
           <w:sz w:val="16"/>
         </w:rPr>
-        <w:t>Manual preparado a partir da versão publicada do KeyNotesAI e de telas reais do sistema. A interface poderá receber ajustes sem alterar o fluxo essencial.</w:t>
+        <w:t>Manual versão 1.1, preparado a partir da versão publicada do KeyNotesAI e de telas reais do sistema. A interface poderá receber ajustes sem alterar o fluxo essencial.</w:t>
       </w:r>
     </w:p>
     <w:sectPr>

</xml_diff>

<commit_message>
docs: atualiza manual com identificação de locutores
</commit_message>
<xml_diff>
--- a/output/manual/Manual-KeyNotesAI.docx
+++ b/output/manual/Manual-KeyNotesAI.docx
@@ -150,7 +150,7 @@
                 <w:color w:val="35694F"/>
                 <w:sz w:val="20"/>
               </w:rPr>
-              <w:t xml:space="preserve">Versão 1.1  </w:t>
+              <w:t xml:space="preserve">Versão 1.2  </w:t>
             </w:r>
             <w:r>
               <w:rPr>
@@ -159,7 +159,7 @@
                 <w:color w:val="191A18"/>
                 <w:sz w:val="18"/>
               </w:rPr>
-              <w:t>Guia prático para usuários autorizados e administradores. Atualizado em 24/08/2026, com suporte ao Google Meet.</w:t>
+              <w:t>Guia prático para usuários autorizados e administradores. Atualizado em 24/08/2026, com identificação de locutores e conversa semântica.</w:t>
             </w:r>
           </w:p>
         </w:tc>
@@ -373,7 +373,7 @@
                 <w:color w:val="191A18"/>
                 <w:sz w:val="18"/>
               </w:rPr>
-              <w:t>Informe um título e escolha o processamento híbrido (padrão) ou totalmente OpenAI.</w:t>
+              <w:t>Informe um título e escolha o processamento híbrido (padrão), totalmente OpenAI ou OpenAI + locutores.</w:t>
             </w:r>
           </w:p>
         </w:tc>
@@ -1542,7 +1542,7 @@
                 <w:color w:val="191A18"/>
                 <w:sz w:val="18"/>
               </w:rPr>
-              <w:t>Híbrido: padrão e menor custo; a transcrição é local e a OpenAI cuida da análise/documentos. Totalmente OpenAI: envia também o áudio para transcrição; costuma ser mais rápido e robusto, com custo adicional por minuto.</w:t>
+              <w:t>Híbrido: padrão e menor custo. Totalmente OpenAI: envia também o áudio para transcrição. OpenAI + locutores: separa as vozes, tenta associá-las aos nomes da chamada inicial e permite revisão manual antes dos documentos.</w:t>
             </w:r>
           </w:p>
         </w:tc>
@@ -2408,8 +2408,107 @@
       </w:pPr>
     </w:p>
     <w:p>
-      <w:r>
-        <w:br w:type="page"/>
+      <w:pPr>
+        <w:pStyle w:val="Heading2"/>
+      </w:pPr>
+      <w:r>
+        <w:t>Chamada inicial para identificar vozes</w:t>
+      </w:r>
+    </w:p>
+    <w:p>
+      <w:pPr>
+        <w:spacing w:after="60" w:line="264" w:lineRule="auto"/>
+        <w:ind w:left="360" w:hanging="259"/>
+      </w:pPr>
+      <w:r>
+        <w:rPr>
+          <w:rFonts w:ascii="Aptos" w:hAnsi="Aptos"/>
+          <w:b/>
+          <w:color w:val="C89A56"/>
+          <w:sz w:val="19"/>
+        </w:rPr>
+        <w:t xml:space="preserve">• </w:t>
+      </w:r>
+      <w:r>
+        <w:rPr>
+          <w:rFonts w:ascii="Aptos" w:hAnsi="Aptos"/>
+          <w:b w:val="0"/>
+          <w:color w:val="191A18"/>
+          <w:sz w:val="19"/>
+        </w:rPr>
+        <w:t>Antes da discussão, peça que cada pessoa diga claramente: “Meu nome é [nome completo] e estou presente”.</w:t>
+      </w:r>
+    </w:p>
+    <w:p>
+      <w:pPr>
+        <w:spacing w:after="60" w:line="264" w:lineRule="auto"/>
+        <w:ind w:left="360" w:hanging="259"/>
+      </w:pPr>
+      <w:r>
+        <w:rPr>
+          <w:rFonts w:ascii="Aptos" w:hAnsi="Aptos"/>
+          <w:b/>
+          <w:color w:val="C89A56"/>
+          <w:sz w:val="19"/>
+        </w:rPr>
+        <w:t xml:space="preserve">• </w:t>
+      </w:r>
+      <w:r>
+        <w:rPr>
+          <w:rFonts w:ascii="Aptos" w:hAnsi="Aptos"/>
+          <w:b w:val="0"/>
+          <w:color w:val="191A18"/>
+          <w:sz w:val="19"/>
+        </w:rPr>
+        <w:t>Faça a chamada também no Google Meet; o nome exibido na tela não vem tecnicamente ligado ao áudio capturado.</w:t>
+      </w:r>
+    </w:p>
+    <w:p>
+      <w:pPr>
+        <w:spacing w:after="60" w:line="264" w:lineRule="auto"/>
+        <w:ind w:left="360" w:hanging="259"/>
+      </w:pPr>
+      <w:r>
+        <w:rPr>
+          <w:rFonts w:ascii="Aptos" w:hAnsi="Aptos"/>
+          <w:b/>
+          <w:color w:val="C89A56"/>
+          <w:sz w:val="19"/>
+        </w:rPr>
+        <w:t xml:space="preserve">• </w:t>
+      </w:r>
+      <w:r>
+        <w:rPr>
+          <w:rFonts w:ascii="Aptos" w:hAnsi="Aptos"/>
+          <w:b w:val="0"/>
+          <w:color w:val="191A18"/>
+          <w:sz w:val="19"/>
+        </w:rPr>
+        <w:t>Evite apresentações simultâneas e aguarde uma pessoa terminar antes da próxima.</w:t>
+      </w:r>
+    </w:p>
+    <w:p>
+      <w:pPr>
+        <w:spacing w:after="60" w:line="264" w:lineRule="auto"/>
+        <w:ind w:left="360" w:hanging="259"/>
+      </w:pPr>
+      <w:r>
+        <w:rPr>
+          <w:rFonts w:ascii="Aptos" w:hAnsi="Aptos"/>
+          <w:b/>
+          <w:color w:val="C89A56"/>
+          <w:sz w:val="19"/>
+        </w:rPr>
+        <w:t xml:space="preserve">• </w:t>
+      </w:r>
+      <w:r>
+        <w:rPr>
+          <w:rFonts w:ascii="Aptos" w:hAnsi="Aptos"/>
+          <w:b w:val="0"/>
+          <w:color w:val="191A18"/>
+          <w:sz w:val="19"/>
+        </w:rPr>
+        <w:t>Depois da transcrição, confira a associação entre Locutor A/B e os nomes registrados.</w:t>
       </w:r>
     </w:p>
     <w:p>
@@ -2937,7 +3036,7 @@
         <w:pStyle w:val="Heading2"/>
       </w:pPr>
       <w:r>
-        <w:t>O que a análise produz</w:t>
+        <w:t>Identificação de locutores</w:t>
       </w:r>
     </w:p>
     <w:p>
@@ -2961,7 +3060,7 @@
           <w:color w:val="191A18"/>
           <w:sz w:val="19"/>
         </w:rPr>
-        <w:t>Resumo e temas principais.</w:t>
+        <w:t>Selecione “OpenAI + locutores” antes de transcrever.</w:t>
       </w:r>
     </w:p>
     <w:p>
@@ -2985,7 +3084,7 @@
           <w:color w:val="191A18"/>
           <w:sz w:val="19"/>
         </w:rPr>
-        <w:t>Participantes identificados.</w:t>
+        <w:t>O sistema separa as falas e adiciona horário e identificação provisória de locutor.</w:t>
       </w:r>
     </w:p>
     <w:p>
@@ -3009,7 +3108,7 @@
           <w:color w:val="191A18"/>
           <w:sz w:val="19"/>
         </w:rPr>
-        <w:t>Ações propostas, com responsável/prazo/prioridade quando mencionados.</w:t>
+        <w:t>A chamada inicial e a lista de presença são usadas para sugerir os nomes.</w:t>
       </w:r>
     </w:p>
     <w:p>
@@ -3033,7 +3132,7 @@
           <w:color w:val="191A18"/>
           <w:sz w:val="19"/>
         </w:rPr>
-        <w:t>Decisões, pendências e bloqueios.</w:t>
+        <w:t>Na área “Conferir identificação dos locutores”, corrija ou complete cada nome.</w:t>
       </w:r>
     </w:p>
     <w:p>
@@ -3057,7 +3156,7 @@
           <w:color w:val="191A18"/>
           <w:sz w:val="19"/>
         </w:rPr>
-        <w:t>Ata, resumo executivo, matriz de ações e registro de decisões.</w:t>
+        <w:t>Somente depois da conferência, execute a análise e gere os documentos.</w:t>
       </w:r>
     </w:p>
     <w:tbl>
@@ -3093,7 +3192,7 @@
                 <w:color w:val="35694F"/>
                 <w:sz w:val="20"/>
               </w:rPr>
-              <w:t xml:space="preserve">Qualidade  </w:t>
+              <w:t xml:space="preserve">Funciona em qualquer origem  </w:t>
             </w:r>
             <w:r>
               <w:rPr>
@@ -3102,7 +3201,7 @@
                 <w:color w:val="191A18"/>
                 <w:sz w:val="18"/>
               </w:rPr>
-              <w:t>A análise depende da transcrição. Antes de gerar documentos, corrija especialmente nomes próprios, datas, valores e compromissos.</w:t>
+              <w:t>Google Meet, reunião presencial e áudio importado são aceitos. A precisão depende da clareza do áudio, da distância do microfone e de não haver falas simultâneas. Quando não houver evidência suficiente, o sistema mantém Locutor A/B em vez de inventar um nome.</w:t>
             </w:r>
           </w:p>
         </w:tc>
@@ -3112,6 +3211,134 @@
       <w:pPr>
         <w:spacing w:after="20"/>
       </w:pPr>
+    </w:p>
+    <w:p>
+      <w:pPr>
+        <w:pStyle w:val="Heading2"/>
+      </w:pPr>
+      <w:r>
+        <w:t>O que a análise produz</w:t>
+      </w:r>
+    </w:p>
+    <w:p>
+      <w:pPr>
+        <w:spacing w:after="60" w:line="264" w:lineRule="auto"/>
+        <w:ind w:left="360" w:hanging="259"/>
+      </w:pPr>
+      <w:r>
+        <w:rPr>
+          <w:rFonts w:ascii="Aptos" w:hAnsi="Aptos"/>
+          <w:b/>
+          <w:color w:val="C89A56"/>
+          <w:sz w:val="19"/>
+        </w:rPr>
+        <w:t xml:space="preserve">• </w:t>
+      </w:r>
+      <w:r>
+        <w:rPr>
+          <w:rFonts w:ascii="Aptos" w:hAnsi="Aptos"/>
+          <w:b w:val="0"/>
+          <w:color w:val="191A18"/>
+          <w:sz w:val="19"/>
+        </w:rPr>
+        <w:t>Resumo e temas principais.</w:t>
+      </w:r>
+    </w:p>
+    <w:p>
+      <w:pPr>
+        <w:spacing w:after="60" w:line="264" w:lineRule="auto"/>
+        <w:ind w:left="360" w:hanging="259"/>
+      </w:pPr>
+      <w:r>
+        <w:rPr>
+          <w:rFonts w:ascii="Aptos" w:hAnsi="Aptos"/>
+          <w:b/>
+          <w:color w:val="C89A56"/>
+          <w:sz w:val="19"/>
+        </w:rPr>
+        <w:t xml:space="preserve">• </w:t>
+      </w:r>
+      <w:r>
+        <w:rPr>
+          <w:rFonts w:ascii="Aptos" w:hAnsi="Aptos"/>
+          <w:b w:val="0"/>
+          <w:color w:val="191A18"/>
+          <w:sz w:val="19"/>
+        </w:rPr>
+        <w:t>Participantes identificados.</w:t>
+      </w:r>
+    </w:p>
+    <w:p>
+      <w:pPr>
+        <w:spacing w:after="60" w:line="264" w:lineRule="auto"/>
+        <w:ind w:left="360" w:hanging="259"/>
+      </w:pPr>
+      <w:r>
+        <w:rPr>
+          <w:rFonts w:ascii="Aptos" w:hAnsi="Aptos"/>
+          <w:b/>
+          <w:color w:val="C89A56"/>
+          <w:sz w:val="19"/>
+        </w:rPr>
+        <w:t xml:space="preserve">• </w:t>
+      </w:r>
+      <w:r>
+        <w:rPr>
+          <w:rFonts w:ascii="Aptos" w:hAnsi="Aptos"/>
+          <w:b w:val="0"/>
+          <w:color w:val="191A18"/>
+          <w:sz w:val="19"/>
+        </w:rPr>
+        <w:t>Ações propostas, com responsável/prazo/prioridade quando mencionados.</w:t>
+      </w:r>
+    </w:p>
+    <w:p>
+      <w:pPr>
+        <w:spacing w:after="60" w:line="264" w:lineRule="auto"/>
+        <w:ind w:left="360" w:hanging="259"/>
+      </w:pPr>
+      <w:r>
+        <w:rPr>
+          <w:rFonts w:ascii="Aptos" w:hAnsi="Aptos"/>
+          <w:b/>
+          <w:color w:val="C89A56"/>
+          <w:sz w:val="19"/>
+        </w:rPr>
+        <w:t xml:space="preserve">• </w:t>
+      </w:r>
+      <w:r>
+        <w:rPr>
+          <w:rFonts w:ascii="Aptos" w:hAnsi="Aptos"/>
+          <w:b w:val="0"/>
+          <w:color w:val="191A18"/>
+          <w:sz w:val="19"/>
+        </w:rPr>
+        <w:t>Decisões, pendências e bloqueios.</w:t>
+      </w:r>
+    </w:p>
+    <w:p>
+      <w:pPr>
+        <w:spacing w:after="60" w:line="264" w:lineRule="auto"/>
+        <w:ind w:left="360" w:hanging="259"/>
+      </w:pPr>
+      <w:r>
+        <w:rPr>
+          <w:rFonts w:ascii="Aptos" w:hAnsi="Aptos"/>
+          <w:b/>
+          <w:color w:val="C89A56"/>
+          <w:sz w:val="19"/>
+        </w:rPr>
+        <w:t xml:space="preserve">• </w:t>
+      </w:r>
+      <w:r>
+        <w:rPr>
+          <w:rFonts w:ascii="Aptos" w:hAnsi="Aptos"/>
+          <w:b w:val="0"/>
+          <w:color w:val="191A18"/>
+          <w:sz w:val="19"/>
+        </w:rPr>
+        <w:t>Ata, resumo executivo, matriz de ações e registro de decisões.</w:t>
+      </w:r>
     </w:p>
     <w:p>
       <w:r>
@@ -3598,7 +3825,7 @@
           <w:color w:val="191A18"/>
           <w:sz w:val="19"/>
         </w:rPr>
-        <w:t>A descrição da ação vem da reunião. Depois do processamento, você pode ajustar os campos operacionais sem alterar o compromisso registrado.</w:t>
+        <w:t>A descrição da ação vem da reunião. Depois do processamento, você pode ajustar os campos operacionais sem alterar o compromisso registrado. Confirme na transcrição se “posso fazer” virou uma responsabilidade efetivamente acordada antes de tratar uma candidatura como compromisso.</w:t>
       </w:r>
     </w:p>
     <w:p>
@@ -4017,7 +4244,7 @@
           <w:color w:val="191A18"/>
           <w:sz w:val="19"/>
         </w:rPr>
-        <w:t>Leia a resposta, que usa os dados reais da reunião selecionada.</w:t>
+        <w:t>Leia a resposta semântica, construída com transcrição, resumo, temas, ações e decisões.</w:t>
       </w:r>
     </w:p>
     <w:p>
@@ -4042,6 +4269,30 @@
           <w:sz w:val="19"/>
         </w:rPr>
         <w:t>Continue perguntando: o histórico mostra cada pergunta e a respectiva resposta.</w:t>
+      </w:r>
+    </w:p>
+    <w:p>
+      <w:pPr>
+        <w:spacing w:after="60" w:line="264" w:lineRule="auto"/>
+        <w:ind w:left="360" w:hanging="259"/>
+      </w:pPr>
+      <w:r>
+        <w:rPr>
+          <w:rFonts w:ascii="Aptos" w:hAnsi="Aptos"/>
+          <w:b/>
+          <w:color w:val="C89A56"/>
+          <w:sz w:val="19"/>
+        </w:rPr>
+        <w:t xml:space="preserve">6. </w:t>
+      </w:r>
+      <w:r>
+        <w:rPr>
+          <w:rFonts w:ascii="Aptos" w:hAnsi="Aptos"/>
+          <w:b w:val="0"/>
+          <w:color w:val="191A18"/>
+          <w:sz w:val="19"/>
+        </w:rPr>
+        <w:t>Para recomeçar, clique em “Apagar conversa” e confirme; somente o histórico da reunião selecionada será removido.</w:t>
       </w:r>
     </w:p>
     <w:p>
@@ -4279,6 +4530,28 @@
       <w:pPr>
         <w:spacing w:after="20"/>
       </w:pPr>
+    </w:p>
+    <w:p>
+      <w:pPr>
+        <w:pStyle w:val="Heading2"/>
+      </w:pPr>
+      <w:r>
+        <w:t>Sair do sistema</w:t>
+      </w:r>
+    </w:p>
+    <w:p>
+      <w:pPr>
+        <w:spacing w:after="80" w:line="269" w:lineRule="auto"/>
+      </w:pPr>
+      <w:r>
+        <w:rPr>
+          <w:rFonts w:ascii="Aptos" w:hAnsi="Aptos"/>
+          <w:b w:val="0"/>
+          <w:color w:val="191A18"/>
+          <w:sz w:val="19"/>
+        </w:rPr>
+        <w:t>Clique no ícone do KeyNotesAI no topo do menu esquerdo. A sessão será encerrada pela autenticação oficial e o aplicativo retornará à capa. No celular, use o mesmo ícone no cabeçalho.</w:t>
+      </w:r>
     </w:p>
     <w:p>
       <w:r>
@@ -6078,6 +6351,98 @@
                 <w:color w:val="35694F"/>
                 <w:sz w:val="17"/>
               </w:rPr>
+              <w:t>Locutor sem nome</w:t>
+            </w:r>
+          </w:p>
+        </w:tc>
+        <w:tc>
+          <w:tcPr>
+            <w:tcW w:type="dxa" w:w="6120"/>
+            <w:tcMar>
+              <w:top w:w="90" w:type="dxa"/>
+              <w:start w:w="120" w:type="dxa"/>
+              <w:bottom w:w="90" w:type="dxa"/>
+              <w:end w:w="120" w:type="dxa"/>
+            </w:tcMar>
+          </w:tcPr>
+          <w:p>
+            <w:r>
+              <w:rPr>
+                <w:rFonts w:ascii="Aptos" w:hAnsi="Aptos"/>
+                <w:b w:val="0"/>
+                <w:color w:val="191A18"/>
+                <w:sz w:val="17"/>
+              </w:rPr>
+              <w:t>Confirme que a pessoa falou o nome na chamada inicial; depois associe manualmente o Locutor A/B na área de conferência.</w:t>
+            </w:r>
+          </w:p>
+        </w:tc>
+      </w:tr>
+      <w:tr>
+        <w:tc>
+          <w:tcPr>
+            <w:tcW w:type="dxa" w:w="3240"/>
+            <w:tcMar>
+              <w:top w:w="90" w:type="dxa"/>
+              <w:start w:w="120" w:type="dxa"/>
+              <w:bottom w:w="90" w:type="dxa"/>
+              <w:end w:w="120" w:type="dxa"/>
+            </w:tcMar>
+          </w:tcPr>
+          <w:p>
+            <w:r>
+              <w:rPr>
+                <w:rFonts w:ascii="Aptos" w:hAnsi="Aptos"/>
+                <w:b/>
+                <w:color w:val="35694F"/>
+                <w:sz w:val="17"/>
+              </w:rPr>
+              <w:t>Vozes trocadas</w:t>
+            </w:r>
+          </w:p>
+        </w:tc>
+        <w:tc>
+          <w:tcPr>
+            <w:tcW w:type="dxa" w:w="6120"/>
+            <w:tcMar>
+              <w:top w:w="90" w:type="dxa"/>
+              <w:start w:w="120" w:type="dxa"/>
+              <w:bottom w:w="90" w:type="dxa"/>
+              <w:end w:w="120" w:type="dxa"/>
+            </w:tcMar>
+          </w:tcPr>
+          <w:p>
+            <w:r>
+              <w:rPr>
+                <w:rFonts w:ascii="Aptos" w:hAnsi="Aptos"/>
+                <w:b w:val="0"/>
+                <w:color w:val="191A18"/>
+                <w:sz w:val="17"/>
+              </w:rPr>
+              <w:t>Corrija a associação na revisão de locutores antes de analisar e gerar documentos.</w:t>
+            </w:r>
+          </w:p>
+        </w:tc>
+      </w:tr>
+      <w:tr>
+        <w:tc>
+          <w:tcPr>
+            <w:tcW w:type="dxa" w:w="3240"/>
+            <w:tcMar>
+              <w:top w:w="90" w:type="dxa"/>
+              <w:start w:w="120" w:type="dxa"/>
+              <w:bottom w:w="90" w:type="dxa"/>
+              <w:end w:w="120" w:type="dxa"/>
+            </w:tcMar>
+          </w:tcPr>
+          <w:p>
+            <w:r>
+              <w:rPr>
+                <w:rFonts w:ascii="Aptos" w:hAnsi="Aptos"/>
+                <w:b/>
+                <w:color w:val="35694F"/>
+                <w:sz w:val="17"/>
+              </w:rPr>
               <w:t>Sem ações/decisões</w:t>
             </w:r>
           </w:p>
@@ -6396,7 +6761,7 @@
           <w:color w:val="191A18"/>
           <w:sz w:val="19"/>
         </w:rPr>
-        <w:t>Áudio gravado/importado e participantes conferidos.</w:t>
+        <w:t>Chamada inicial realizada com uma pessoa dizendo o nome por vez, quando usar identificação de locutores.</w:t>
       </w:r>
     </w:p>
     <w:p>
@@ -6420,7 +6785,7 @@
           <w:color w:val="191A18"/>
           <w:sz w:val="19"/>
         </w:rPr>
-        <w:t>Foto registrada com consentimento, se desejada.</w:t>
+        <w:t>Áudio gravado/importado e participantes conferidos.</w:t>
       </w:r>
     </w:p>
     <w:p>
@@ -6444,7 +6809,7 @@
           <w:color w:val="191A18"/>
           <w:sz w:val="19"/>
         </w:rPr>
-        <w:t>Transcrição revisada.</w:t>
+        <w:t>Associação entre vozes e nomes revisada.</w:t>
       </w:r>
     </w:p>
     <w:p>
@@ -6468,7 +6833,7 @@
           <w:color w:val="191A18"/>
           <w:sz w:val="19"/>
         </w:rPr>
-        <w:t>Análise semântica concluída.</w:t>
+        <w:t>Foto registrada com consentimento, se desejada.</w:t>
       </w:r>
     </w:p>
     <w:p>
@@ -6492,7 +6857,7 @@
           <w:color w:val="191A18"/>
           <w:sz w:val="19"/>
         </w:rPr>
-        <w:t>Ata e demais documentos revisados/salvos.</w:t>
+        <w:t>Transcrição revisada.</w:t>
       </w:r>
     </w:p>
     <w:p>
@@ -6516,7 +6881,7 @@
           <w:color w:val="191A18"/>
           <w:sz w:val="19"/>
         </w:rPr>
-        <w:t>Responsáveis, prazos, prioridades e status das ações ajustados.</w:t>
+        <w:t>Análise semântica concluída.</w:t>
       </w:r>
     </w:p>
     <w:p>
@@ -6540,7 +6905,55 @@
           <w:color w:val="191A18"/>
           <w:sz w:val="19"/>
         </w:rPr>
-        <w:t>Perguntas ao chat verificadas, quando necessário.</w:t>
+        <w:t>Ata e demais documentos revisados/salvos.</w:t>
+      </w:r>
+    </w:p>
+    <w:p>
+      <w:pPr>
+        <w:spacing w:after="60" w:line="264" w:lineRule="auto"/>
+        <w:ind w:left="360" w:hanging="259"/>
+      </w:pPr>
+      <w:r>
+        <w:rPr>
+          <w:rFonts w:ascii="Aptos" w:hAnsi="Aptos"/>
+          <w:b/>
+          <w:color w:val="C89A56"/>
+          <w:sz w:val="19"/>
+        </w:rPr>
+        <w:t xml:space="preserve">• </w:t>
+      </w:r>
+      <w:r>
+        <w:rPr>
+          <w:rFonts w:ascii="Aptos" w:hAnsi="Aptos"/>
+          <w:b w:val="0"/>
+          <w:color w:val="191A18"/>
+          <w:sz w:val="19"/>
+        </w:rPr>
+        <w:t>Responsáveis, prazos, prioridades e status das ações ajustados.</w:t>
+      </w:r>
+    </w:p>
+    <w:p>
+      <w:pPr>
+        <w:spacing w:after="60" w:line="264" w:lineRule="auto"/>
+        <w:ind w:left="360" w:hanging="259"/>
+      </w:pPr>
+      <w:r>
+        <w:rPr>
+          <w:rFonts w:ascii="Aptos" w:hAnsi="Aptos"/>
+          <w:b/>
+          <w:color w:val="C89A56"/>
+          <w:sz w:val="19"/>
+        </w:rPr>
+        <w:t xml:space="preserve">• </w:t>
+      </w:r>
+      <w:r>
+        <w:rPr>
+          <w:rFonts w:ascii="Aptos" w:hAnsi="Aptos"/>
+          <w:b w:val="0"/>
+          <w:color w:val="191A18"/>
+          <w:sz w:val="19"/>
+        </w:rPr>
+        <w:t>Perguntas ao chat verificadas e histórico apagado somente quando desejado.</w:t>
       </w:r>
     </w:p>
     <w:p>
@@ -6908,7 +7321,7 @@
           <w:color w:val="73756F"/>
           <w:sz w:val="16"/>
         </w:rPr>
-        <w:t>Manual versão 1.1, preparado a partir da versão publicada do KeyNotesAI e de telas reais do sistema. A interface poderá receber ajustes sem alterar o fluxo essencial.</w:t>
+        <w:t>Manual versão 1.2, preparado a partir da versão publicada do KeyNotesAI e de telas reais do sistema. A interface poderá receber ajustes sem alterar o fluxo essencial.</w:t>
       </w:r>
     </w:p>
     <w:sectPr>

</xml_diff>